<commit_message>
removed loopflopy from yml for easier env setup
</commit_message>
<xml_diff>
--- a/examples/loopflopy_installation.docx
+++ b/examples/loopflopy_installation.docx
@@ -4821,6 +4821,126 @@
     <w:pPr>
       <w:pStyle w:val="Footer"/>
     </w:pPr>
+    <w:r>
+      <w:rPr>
+        <w:noProof/>
+        <w14:ligatures w14:val="standardContextual"/>
+      </w:rPr>
+      <mc:AlternateContent>
+        <mc:Choice Requires="wps">
+          <w:drawing>
+            <wp:anchor distT="0" distB="0" distL="0" distR="0" simplePos="0" relativeHeight="251662336" behindDoc="0" locked="0" layoutInCell="1" allowOverlap="1" wp14:anchorId="7C58F8D0" wp14:editId="04CE90A0">
+              <wp:simplePos x="635" y="635"/>
+              <wp:positionH relativeFrom="page">
+                <wp:align>center</wp:align>
+              </wp:positionH>
+              <wp:positionV relativeFrom="page">
+                <wp:align>bottom</wp:align>
+              </wp:positionV>
+              <wp:extent cx="622300" cy="376555"/>
+              <wp:effectExtent l="0" t="0" r="6350" b="0"/>
+              <wp:wrapNone/>
+              <wp:docPr id="1767268699" name="Text Box 5" descr="OFFICIAL">
+                <a:extLst xmlns:a="http://schemas.openxmlformats.org/drawingml/2006/main">
+                  <a:ext uri="{5AE41FA2-C0FF-4470-9BD4-5FADCA87CBE2}">
+                    <aclsh:classification xmlns:aclsh="http://schemas.microsoft.com/office/drawing/2020/classificationShape" classificationOutcomeType="ftr"/>
+                  </a:ext>
+                </a:extLst>
+              </wp:docPr>
+              <wp:cNvGraphicFramePr/>
+              <a:graphic xmlns:a="http://schemas.openxmlformats.org/drawingml/2006/main">
+                <a:graphicData uri="http://schemas.microsoft.com/office/word/2010/wordprocessingShape">
+                  <wps:wsp>
+                    <wps:cNvSpPr txBox="1"/>
+                    <wps:spPr>
+                      <a:xfrm>
+                        <a:off x="0" y="0"/>
+                        <a:ext cx="622300" cy="376555"/>
+                      </a:xfrm>
+                      <a:prstGeom prst="rect">
+                        <a:avLst/>
+                      </a:prstGeom>
+                      <a:noFill/>
+                      <a:ln>
+                        <a:noFill/>
+                      </a:ln>
+                    </wps:spPr>
+                    <wps:txbx>
+                      <w:txbxContent>
+                        <w:p>
+                          <w:pPr>
+                            <w:rPr>
+                              <w:rFonts w:ascii="Aptos" w:eastAsia="Aptos" w:hAnsi="Aptos" w:cs="Aptos"/>
+                              <w:noProof/>
+                              <w:color w:val="FF0000"/>
+                              <w:sz w:val="24"/>
+                              <w:szCs w:val="24"/>
+                            </w:rPr>
+                          </w:pPr>
+                          <w:r>
+                            <w:rPr>
+                              <w:rFonts w:ascii="Aptos" w:eastAsia="Aptos" w:hAnsi="Aptos" w:cs="Aptos"/>
+                              <w:noProof/>
+                              <w:color w:val="FF0000"/>
+                              <w:sz w:val="24"/>
+                              <w:szCs w:val="24"/>
+                            </w:rPr>
+                            <w:t>OFFICIAL</w:t>
+                          </w:r>
+                        </w:p>
+                      </w:txbxContent>
+                    </wps:txbx>
+                    <wps:bodyPr rot="0" spcFirstLastPara="0" vertOverflow="overflow" horzOverflow="overflow" vert="horz" wrap="none" lIns="0" tIns="0" rIns="0" bIns="190500" numCol="1" spcCol="0" rtlCol="0" fromWordArt="0" anchor="b" anchorCtr="0" forceAA="0" compatLnSpc="1">
+                      <a:prstTxWarp prst="textNoShape">
+                        <a:avLst/>
+                      </a:prstTxWarp>
+                      <a:spAutoFit/>
+                    </wps:bodyPr>
+                  </wps:wsp>
+                </a:graphicData>
+              </a:graphic>
+            </wp:anchor>
+          </w:drawing>
+        </mc:Choice>
+        <mc:Fallback>
+          <w:pict>
+            <v:shapetype w14:anchorId="7C58F8D0" id="_x0000_t202" coordsize="21600,21600" o:spt="202" path="m,l,21600r21600,l21600,xe">
+              <v:stroke joinstyle="miter"/>
+              <v:path gradientshapeok="t" o:connecttype="rect"/>
+            </v:shapetype>
+            <v:shape id="Text Box 5" o:spid="_x0000_s1028" type="#_x0000_t202" alt="OFFICIAL" style="position:absolute;margin-left:0;margin-top:0;width:49pt;height:29.65pt;z-index:251662336;visibility:visible;mso-wrap-style:none;mso-wrap-distance-left:0;mso-wrap-distance-top:0;mso-wrap-distance-right:0;mso-wrap-distance-bottom:0;mso-position-horizontal:center;mso-position-horizontal-relative:page;mso-position-vertical:bottom;mso-position-vertical-relative:page;v-text-anchor:bottom" o:gfxdata="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" filled="f" stroked="f">
+              <v:fill o:detectmouseclick="t"/>
+              <v:textbox style="mso-fit-shape-to-text:t" inset="0,0,0,15pt">
+                <w:txbxContent>
+                  <w:p>
+                    <w:pPr>
+                      <w:rPr>
+                        <w:rFonts w:ascii="Aptos" w:eastAsia="Aptos" w:hAnsi="Aptos" w:cs="Aptos"/>
+                        <w:noProof/>
+                        <w:color w:val="FF0000"/>
+                        <w:sz w:val="24"/>
+                        <w:szCs w:val="24"/>
+                      </w:rPr>
+                    </w:pPr>
+                    <w:r>
+                      <w:rPr>
+                        <w:rFonts w:ascii="Aptos" w:eastAsia="Aptos" w:hAnsi="Aptos" w:cs="Aptos"/>
+                        <w:noProof/>
+                        <w:color w:val="FF0000"/>
+                        <w:sz w:val="24"/>
+                        <w:szCs w:val="24"/>
+                      </w:rPr>
+                      <w:t>OFFICIAL</w:t>
+                    </w:r>
+                  </w:p>
+                </w:txbxContent>
+              </v:textbox>
+              <w10:wrap anchorx="page" anchory="page"/>
+            </v:shape>
+          </w:pict>
+        </mc:Fallback>
+      </mc:AlternateContent>
+    </w:r>
   </w:p>
 </w:ftr>
 </file>
@@ -4831,6 +4951,126 @@
     <w:pPr>
       <w:pStyle w:val="Footer"/>
     </w:pPr>
+    <w:r>
+      <w:rPr>
+        <w:noProof/>
+        <w14:ligatures w14:val="standardContextual"/>
+      </w:rPr>
+      <mc:AlternateContent>
+        <mc:Choice Requires="wps">
+          <w:drawing>
+            <wp:anchor distT="0" distB="0" distL="0" distR="0" simplePos="0" relativeHeight="251663360" behindDoc="0" locked="0" layoutInCell="1" allowOverlap="1" wp14:anchorId="65F0203B" wp14:editId="6CBBA1A4">
+              <wp:simplePos x="457200" y="10071100"/>
+              <wp:positionH relativeFrom="page">
+                <wp:align>center</wp:align>
+              </wp:positionH>
+              <wp:positionV relativeFrom="page">
+                <wp:align>bottom</wp:align>
+              </wp:positionV>
+              <wp:extent cx="622300" cy="376555"/>
+              <wp:effectExtent l="0" t="0" r="6350" b="0"/>
+              <wp:wrapNone/>
+              <wp:docPr id="2064804933" name="Text Box 6" descr="OFFICIAL">
+                <a:extLst xmlns:a="http://schemas.openxmlformats.org/drawingml/2006/main">
+                  <a:ext uri="{5AE41FA2-C0FF-4470-9BD4-5FADCA87CBE2}">
+                    <aclsh:classification xmlns:aclsh="http://schemas.microsoft.com/office/drawing/2020/classificationShape" classificationOutcomeType="ftr"/>
+                  </a:ext>
+                </a:extLst>
+              </wp:docPr>
+              <wp:cNvGraphicFramePr/>
+              <a:graphic xmlns:a="http://schemas.openxmlformats.org/drawingml/2006/main">
+                <a:graphicData uri="http://schemas.microsoft.com/office/word/2010/wordprocessingShape">
+                  <wps:wsp>
+                    <wps:cNvSpPr txBox="1"/>
+                    <wps:spPr>
+                      <a:xfrm>
+                        <a:off x="0" y="0"/>
+                        <a:ext cx="622300" cy="376555"/>
+                      </a:xfrm>
+                      <a:prstGeom prst="rect">
+                        <a:avLst/>
+                      </a:prstGeom>
+                      <a:noFill/>
+                      <a:ln>
+                        <a:noFill/>
+                      </a:ln>
+                    </wps:spPr>
+                    <wps:txbx>
+                      <w:txbxContent>
+                        <w:p>
+                          <w:pPr>
+                            <w:rPr>
+                              <w:rFonts w:ascii="Aptos" w:eastAsia="Aptos" w:hAnsi="Aptos" w:cs="Aptos"/>
+                              <w:noProof/>
+                              <w:color w:val="FF0000"/>
+                              <w:sz w:val="24"/>
+                              <w:szCs w:val="24"/>
+                            </w:rPr>
+                          </w:pPr>
+                          <w:r>
+                            <w:rPr>
+                              <w:rFonts w:ascii="Aptos" w:eastAsia="Aptos" w:hAnsi="Aptos" w:cs="Aptos"/>
+                              <w:noProof/>
+                              <w:color w:val="FF0000"/>
+                              <w:sz w:val="24"/>
+                              <w:szCs w:val="24"/>
+                            </w:rPr>
+                            <w:t>OFFICIAL</w:t>
+                          </w:r>
+                        </w:p>
+                      </w:txbxContent>
+                    </wps:txbx>
+                    <wps:bodyPr rot="0" spcFirstLastPara="0" vertOverflow="overflow" horzOverflow="overflow" vert="horz" wrap="none" lIns="0" tIns="0" rIns="0" bIns="190500" numCol="1" spcCol="0" rtlCol="0" fromWordArt="0" anchor="b" anchorCtr="0" forceAA="0" compatLnSpc="1">
+                      <a:prstTxWarp prst="textNoShape">
+                        <a:avLst/>
+                      </a:prstTxWarp>
+                      <a:spAutoFit/>
+                    </wps:bodyPr>
+                  </wps:wsp>
+                </a:graphicData>
+              </a:graphic>
+            </wp:anchor>
+          </w:drawing>
+        </mc:Choice>
+        <mc:Fallback>
+          <w:pict>
+            <v:shapetype w14:anchorId="65F0203B" id="_x0000_t202" coordsize="21600,21600" o:spt="202" path="m,l,21600r21600,l21600,xe">
+              <v:stroke joinstyle="miter"/>
+              <v:path gradientshapeok="t" o:connecttype="rect"/>
+            </v:shapetype>
+            <v:shape id="Text Box 6" o:spid="_x0000_s1029" type="#_x0000_t202" alt="OFFICIAL" style="position:absolute;margin-left:0;margin-top:0;width:49pt;height:29.65pt;z-index:251663360;visibility:visible;mso-wrap-style:none;mso-wrap-distance-left:0;mso-wrap-distance-top:0;mso-wrap-distance-right:0;mso-wrap-distance-bottom:0;mso-position-horizontal:center;mso-position-horizontal-relative:page;mso-position-vertical:bottom;mso-position-vertical-relative:page;v-text-anchor:bottom" o:gfxdata="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" filled="f" stroked="f">
+              <v:fill o:detectmouseclick="t"/>
+              <v:textbox style="mso-fit-shape-to-text:t" inset="0,0,0,15pt">
+                <w:txbxContent>
+                  <w:p>
+                    <w:pPr>
+                      <w:rPr>
+                        <w:rFonts w:ascii="Aptos" w:eastAsia="Aptos" w:hAnsi="Aptos" w:cs="Aptos"/>
+                        <w:noProof/>
+                        <w:color w:val="FF0000"/>
+                        <w:sz w:val="24"/>
+                        <w:szCs w:val="24"/>
+                      </w:rPr>
+                    </w:pPr>
+                    <w:r>
+                      <w:rPr>
+                        <w:rFonts w:ascii="Aptos" w:eastAsia="Aptos" w:hAnsi="Aptos" w:cs="Aptos"/>
+                        <w:noProof/>
+                        <w:color w:val="FF0000"/>
+                        <w:sz w:val="24"/>
+                        <w:szCs w:val="24"/>
+                      </w:rPr>
+                      <w:t>OFFICIAL</w:t>
+                    </w:r>
+                  </w:p>
+                </w:txbxContent>
+              </v:textbox>
+              <w10:wrap anchorx="page" anchory="page"/>
+            </v:shape>
+          </w:pict>
+        </mc:Fallback>
+      </mc:AlternateContent>
+    </w:r>
   </w:p>
 </w:ftr>
 </file>
@@ -4841,6 +5081,126 @@
     <w:pPr>
       <w:pStyle w:val="Footer"/>
     </w:pPr>
+    <w:r>
+      <w:rPr>
+        <w:noProof/>
+        <w14:ligatures w14:val="standardContextual"/>
+      </w:rPr>
+      <mc:AlternateContent>
+        <mc:Choice Requires="wps">
+          <w:drawing>
+            <wp:anchor distT="0" distB="0" distL="0" distR="0" simplePos="0" relativeHeight="251661312" behindDoc="0" locked="0" layoutInCell="1" allowOverlap="1" wp14:anchorId="41C8401C" wp14:editId="40C2069F">
+              <wp:simplePos x="635" y="635"/>
+              <wp:positionH relativeFrom="page">
+                <wp:align>center</wp:align>
+              </wp:positionH>
+              <wp:positionV relativeFrom="page">
+                <wp:align>bottom</wp:align>
+              </wp:positionV>
+              <wp:extent cx="622300" cy="376555"/>
+              <wp:effectExtent l="0" t="0" r="6350" b="0"/>
+              <wp:wrapNone/>
+              <wp:docPr id="345174913" name="Text Box 4" descr="OFFICIAL">
+                <a:extLst xmlns:a="http://schemas.openxmlformats.org/drawingml/2006/main">
+                  <a:ext uri="{5AE41FA2-C0FF-4470-9BD4-5FADCA87CBE2}">
+                    <aclsh:classification xmlns:aclsh="http://schemas.microsoft.com/office/drawing/2020/classificationShape" classificationOutcomeType="ftr"/>
+                  </a:ext>
+                </a:extLst>
+              </wp:docPr>
+              <wp:cNvGraphicFramePr/>
+              <a:graphic xmlns:a="http://schemas.openxmlformats.org/drawingml/2006/main">
+                <a:graphicData uri="http://schemas.microsoft.com/office/word/2010/wordprocessingShape">
+                  <wps:wsp>
+                    <wps:cNvSpPr txBox="1"/>
+                    <wps:spPr>
+                      <a:xfrm>
+                        <a:off x="0" y="0"/>
+                        <a:ext cx="622300" cy="376555"/>
+                      </a:xfrm>
+                      <a:prstGeom prst="rect">
+                        <a:avLst/>
+                      </a:prstGeom>
+                      <a:noFill/>
+                      <a:ln>
+                        <a:noFill/>
+                      </a:ln>
+                    </wps:spPr>
+                    <wps:txbx>
+                      <w:txbxContent>
+                        <w:p>
+                          <w:pPr>
+                            <w:rPr>
+                              <w:rFonts w:ascii="Aptos" w:eastAsia="Aptos" w:hAnsi="Aptos" w:cs="Aptos"/>
+                              <w:noProof/>
+                              <w:color w:val="FF0000"/>
+                              <w:sz w:val="24"/>
+                              <w:szCs w:val="24"/>
+                            </w:rPr>
+                          </w:pPr>
+                          <w:r>
+                            <w:rPr>
+                              <w:rFonts w:ascii="Aptos" w:eastAsia="Aptos" w:hAnsi="Aptos" w:cs="Aptos"/>
+                              <w:noProof/>
+                              <w:color w:val="FF0000"/>
+                              <w:sz w:val="24"/>
+                              <w:szCs w:val="24"/>
+                            </w:rPr>
+                            <w:t>OFFICIAL</w:t>
+                          </w:r>
+                        </w:p>
+                      </w:txbxContent>
+                    </wps:txbx>
+                    <wps:bodyPr rot="0" spcFirstLastPara="0" vertOverflow="overflow" horzOverflow="overflow" vert="horz" wrap="none" lIns="0" tIns="0" rIns="0" bIns="190500" numCol="1" spcCol="0" rtlCol="0" fromWordArt="0" anchor="b" anchorCtr="0" forceAA="0" compatLnSpc="1">
+                      <a:prstTxWarp prst="textNoShape">
+                        <a:avLst/>
+                      </a:prstTxWarp>
+                      <a:spAutoFit/>
+                    </wps:bodyPr>
+                  </wps:wsp>
+                </a:graphicData>
+              </a:graphic>
+            </wp:anchor>
+          </w:drawing>
+        </mc:Choice>
+        <mc:Fallback>
+          <w:pict>
+            <v:shapetype w14:anchorId="41C8401C" id="_x0000_t202" coordsize="21600,21600" o:spt="202" path="m,l,21600r21600,l21600,xe">
+              <v:stroke joinstyle="miter"/>
+              <v:path gradientshapeok="t" o:connecttype="rect"/>
+            </v:shapetype>
+            <v:shape id="Text Box 4" o:spid="_x0000_s1031" type="#_x0000_t202" alt="OFFICIAL" style="position:absolute;margin-left:0;margin-top:0;width:49pt;height:29.65pt;z-index:251661312;visibility:visible;mso-wrap-style:none;mso-wrap-distance-left:0;mso-wrap-distance-top:0;mso-wrap-distance-right:0;mso-wrap-distance-bottom:0;mso-position-horizontal:center;mso-position-horizontal-relative:page;mso-position-vertical:bottom;mso-position-vertical-relative:page;v-text-anchor:bottom" o:gfxdata="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" filled="f" stroked="f">
+              <v:fill o:detectmouseclick="t"/>
+              <v:textbox style="mso-fit-shape-to-text:t" inset="0,0,0,15pt">
+                <w:txbxContent>
+                  <w:p>
+                    <w:pPr>
+                      <w:rPr>
+                        <w:rFonts w:ascii="Aptos" w:eastAsia="Aptos" w:hAnsi="Aptos" w:cs="Aptos"/>
+                        <w:noProof/>
+                        <w:color w:val="FF0000"/>
+                        <w:sz w:val="24"/>
+                        <w:szCs w:val="24"/>
+                      </w:rPr>
+                    </w:pPr>
+                    <w:r>
+                      <w:rPr>
+                        <w:rFonts w:ascii="Aptos" w:eastAsia="Aptos" w:hAnsi="Aptos" w:cs="Aptos"/>
+                        <w:noProof/>
+                        <w:color w:val="FF0000"/>
+                        <w:sz w:val="24"/>
+                        <w:szCs w:val="24"/>
+                      </w:rPr>
+                      <w:t>OFFICIAL</w:t>
+                    </w:r>
+                  </w:p>
+                </w:txbxContent>
+              </v:textbox>
+              <w10:wrap anchorx="page" anchory="page"/>
+            </v:shape>
+          </w:pict>
+        </mc:Fallback>
+      </mc:AlternateContent>
+    </w:r>
   </w:p>
 </w:ftr>
 </file>
@@ -4870,6 +5230,126 @@
     <w:pPr>
       <w:pStyle w:val="Header"/>
     </w:pPr>
+    <w:r>
+      <w:rPr>
+        <w:noProof/>
+        <w14:ligatures w14:val="standardContextual"/>
+      </w:rPr>
+      <mc:AlternateContent>
+        <mc:Choice Requires="wps">
+          <w:drawing>
+            <wp:anchor distT="0" distB="0" distL="0" distR="0" simplePos="0" relativeHeight="251659264" behindDoc="0" locked="0" layoutInCell="1" allowOverlap="1" wp14:anchorId="4E373C93" wp14:editId="6CE7691F">
+              <wp:simplePos x="635" y="635"/>
+              <wp:positionH relativeFrom="page">
+                <wp:align>center</wp:align>
+              </wp:positionH>
+              <wp:positionV relativeFrom="page">
+                <wp:align>top</wp:align>
+              </wp:positionV>
+              <wp:extent cx="622300" cy="376555"/>
+              <wp:effectExtent l="0" t="0" r="6350" b="4445"/>
+              <wp:wrapNone/>
+              <wp:docPr id="963873974" name="Text Box 2" descr="OFFICIAL">
+                <a:extLst xmlns:a="http://schemas.openxmlformats.org/drawingml/2006/main">
+                  <a:ext uri="{5AE41FA2-C0FF-4470-9BD4-5FADCA87CBE2}">
+                    <aclsh:classification xmlns:aclsh="http://schemas.microsoft.com/office/drawing/2020/classificationShape" classificationOutcomeType="hdr"/>
+                  </a:ext>
+                </a:extLst>
+              </wp:docPr>
+              <wp:cNvGraphicFramePr/>
+              <a:graphic xmlns:a="http://schemas.openxmlformats.org/drawingml/2006/main">
+                <a:graphicData uri="http://schemas.microsoft.com/office/word/2010/wordprocessingShape">
+                  <wps:wsp>
+                    <wps:cNvSpPr txBox="1"/>
+                    <wps:spPr>
+                      <a:xfrm>
+                        <a:off x="0" y="0"/>
+                        <a:ext cx="622300" cy="376555"/>
+                      </a:xfrm>
+                      <a:prstGeom prst="rect">
+                        <a:avLst/>
+                      </a:prstGeom>
+                      <a:noFill/>
+                      <a:ln>
+                        <a:noFill/>
+                      </a:ln>
+                    </wps:spPr>
+                    <wps:txbx>
+                      <w:txbxContent>
+                        <w:p>
+                          <w:pPr>
+                            <w:rPr>
+                              <w:rFonts w:ascii="Aptos" w:eastAsia="Aptos" w:hAnsi="Aptos" w:cs="Aptos"/>
+                              <w:noProof/>
+                              <w:color w:val="FF0000"/>
+                              <w:sz w:val="24"/>
+                              <w:szCs w:val="24"/>
+                            </w:rPr>
+                          </w:pPr>
+                          <w:r>
+                            <w:rPr>
+                              <w:rFonts w:ascii="Aptos" w:eastAsia="Aptos" w:hAnsi="Aptos" w:cs="Aptos"/>
+                              <w:noProof/>
+                              <w:color w:val="FF0000"/>
+                              <w:sz w:val="24"/>
+                              <w:szCs w:val="24"/>
+                            </w:rPr>
+                            <w:t>OFFICIAL</w:t>
+                          </w:r>
+                        </w:p>
+                      </w:txbxContent>
+                    </wps:txbx>
+                    <wps:bodyPr rot="0" spcFirstLastPara="0" vertOverflow="overflow" horzOverflow="overflow" vert="horz" wrap="none" lIns="0" tIns="190500" rIns="0" bIns="0" numCol="1" spcCol="0" rtlCol="0" fromWordArt="0" anchor="t" anchorCtr="0" forceAA="0" compatLnSpc="1">
+                      <a:prstTxWarp prst="textNoShape">
+                        <a:avLst/>
+                      </a:prstTxWarp>
+                      <a:spAutoFit/>
+                    </wps:bodyPr>
+                  </wps:wsp>
+                </a:graphicData>
+              </a:graphic>
+            </wp:anchor>
+          </w:drawing>
+        </mc:Choice>
+        <mc:Fallback>
+          <w:pict>
+            <v:shapetype w14:anchorId="4E373C93" id="_x0000_t202" coordsize="21600,21600" o:spt="202" path="m,l,21600r21600,l21600,xe">
+              <v:stroke joinstyle="miter"/>
+              <v:path gradientshapeok="t" o:connecttype="rect"/>
+            </v:shapetype>
+            <v:shape id="Text Box 2" o:spid="_x0000_s1026" type="#_x0000_t202" alt="OFFICIAL" style="position:absolute;margin-left:0;margin-top:0;width:49pt;height:29.65pt;z-index:251659264;visibility:visible;mso-wrap-style:none;mso-wrap-distance-left:0;mso-wrap-distance-top:0;mso-wrap-distance-right:0;mso-wrap-distance-bottom:0;mso-position-horizontal:center;mso-position-horizontal-relative:page;mso-position-vertical:top;mso-position-vertical-relative:page;v-text-anchor:top" o:gfxdata="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" filled="f" stroked="f">
+              <v:fill o:detectmouseclick="t"/>
+              <v:textbox style="mso-fit-shape-to-text:t" inset="0,15pt,0,0">
+                <w:txbxContent>
+                  <w:p>
+                    <w:pPr>
+                      <w:rPr>
+                        <w:rFonts w:ascii="Aptos" w:eastAsia="Aptos" w:hAnsi="Aptos" w:cs="Aptos"/>
+                        <w:noProof/>
+                        <w:color w:val="FF0000"/>
+                        <w:sz w:val="24"/>
+                        <w:szCs w:val="24"/>
+                      </w:rPr>
+                    </w:pPr>
+                    <w:r>
+                      <w:rPr>
+                        <w:rFonts w:ascii="Aptos" w:eastAsia="Aptos" w:hAnsi="Aptos" w:cs="Aptos"/>
+                        <w:noProof/>
+                        <w:color w:val="FF0000"/>
+                        <w:sz w:val="24"/>
+                        <w:szCs w:val="24"/>
+                      </w:rPr>
+                      <w:t>OFFICIAL</w:t>
+                    </w:r>
+                  </w:p>
+                </w:txbxContent>
+              </v:textbox>
+              <w10:wrap anchorx="page" anchory="page"/>
+            </v:shape>
+          </w:pict>
+        </mc:Fallback>
+      </mc:AlternateContent>
+    </w:r>
   </w:p>
 </w:hdr>
 </file>
@@ -4880,6 +5360,126 @@
     <w:pPr>
       <w:pStyle w:val="Header"/>
     </w:pPr>
+    <w:r>
+      <w:rPr>
+        <w:noProof/>
+        <w14:ligatures w14:val="standardContextual"/>
+      </w:rPr>
+      <mc:AlternateContent>
+        <mc:Choice Requires="wps">
+          <w:drawing>
+            <wp:anchor distT="0" distB="0" distL="0" distR="0" simplePos="0" relativeHeight="251660288" behindDoc="0" locked="0" layoutInCell="1" allowOverlap="1" wp14:anchorId="4D3B7A2E" wp14:editId="00F836DA">
+              <wp:simplePos x="457200" y="450850"/>
+              <wp:positionH relativeFrom="page">
+                <wp:align>center</wp:align>
+              </wp:positionH>
+              <wp:positionV relativeFrom="page">
+                <wp:align>top</wp:align>
+              </wp:positionV>
+              <wp:extent cx="622300" cy="376555"/>
+              <wp:effectExtent l="0" t="0" r="6350" b="4445"/>
+              <wp:wrapNone/>
+              <wp:docPr id="1904468321" name="Text Box 3" descr="OFFICIAL">
+                <a:extLst xmlns:a="http://schemas.openxmlformats.org/drawingml/2006/main">
+                  <a:ext uri="{5AE41FA2-C0FF-4470-9BD4-5FADCA87CBE2}">
+                    <aclsh:classification xmlns:aclsh="http://schemas.microsoft.com/office/drawing/2020/classificationShape" classificationOutcomeType="hdr"/>
+                  </a:ext>
+                </a:extLst>
+              </wp:docPr>
+              <wp:cNvGraphicFramePr/>
+              <a:graphic xmlns:a="http://schemas.openxmlformats.org/drawingml/2006/main">
+                <a:graphicData uri="http://schemas.microsoft.com/office/word/2010/wordprocessingShape">
+                  <wps:wsp>
+                    <wps:cNvSpPr txBox="1"/>
+                    <wps:spPr>
+                      <a:xfrm>
+                        <a:off x="0" y="0"/>
+                        <a:ext cx="622300" cy="376555"/>
+                      </a:xfrm>
+                      <a:prstGeom prst="rect">
+                        <a:avLst/>
+                      </a:prstGeom>
+                      <a:noFill/>
+                      <a:ln>
+                        <a:noFill/>
+                      </a:ln>
+                    </wps:spPr>
+                    <wps:txbx>
+                      <w:txbxContent>
+                        <w:p>
+                          <w:pPr>
+                            <w:rPr>
+                              <w:rFonts w:ascii="Aptos" w:eastAsia="Aptos" w:hAnsi="Aptos" w:cs="Aptos"/>
+                              <w:noProof/>
+                              <w:color w:val="FF0000"/>
+                              <w:sz w:val="24"/>
+                              <w:szCs w:val="24"/>
+                            </w:rPr>
+                          </w:pPr>
+                          <w:r>
+                            <w:rPr>
+                              <w:rFonts w:ascii="Aptos" w:eastAsia="Aptos" w:hAnsi="Aptos" w:cs="Aptos"/>
+                              <w:noProof/>
+                              <w:color w:val="FF0000"/>
+                              <w:sz w:val="24"/>
+                              <w:szCs w:val="24"/>
+                            </w:rPr>
+                            <w:t>OFFICIAL</w:t>
+                          </w:r>
+                        </w:p>
+                      </w:txbxContent>
+                    </wps:txbx>
+                    <wps:bodyPr rot="0" spcFirstLastPara="0" vertOverflow="overflow" horzOverflow="overflow" vert="horz" wrap="none" lIns="0" tIns="190500" rIns="0" bIns="0" numCol="1" spcCol="0" rtlCol="0" fromWordArt="0" anchor="t" anchorCtr="0" forceAA="0" compatLnSpc="1">
+                      <a:prstTxWarp prst="textNoShape">
+                        <a:avLst/>
+                      </a:prstTxWarp>
+                      <a:spAutoFit/>
+                    </wps:bodyPr>
+                  </wps:wsp>
+                </a:graphicData>
+              </a:graphic>
+            </wp:anchor>
+          </w:drawing>
+        </mc:Choice>
+        <mc:Fallback>
+          <w:pict>
+            <v:shapetype w14:anchorId="4D3B7A2E" id="_x0000_t202" coordsize="21600,21600" o:spt="202" path="m,l,21600r21600,l21600,xe">
+              <v:stroke joinstyle="miter"/>
+              <v:path gradientshapeok="t" o:connecttype="rect"/>
+            </v:shapetype>
+            <v:shape id="Text Box 3" o:spid="_x0000_s1027" type="#_x0000_t202" alt="OFFICIAL" style="position:absolute;margin-left:0;margin-top:0;width:49pt;height:29.65pt;z-index:251660288;visibility:visible;mso-wrap-style:none;mso-wrap-distance-left:0;mso-wrap-distance-top:0;mso-wrap-distance-right:0;mso-wrap-distance-bottom:0;mso-position-horizontal:center;mso-position-horizontal-relative:page;mso-position-vertical:top;mso-position-vertical-relative:page;v-text-anchor:top" o:gfxdata="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" filled="f" stroked="f">
+              <v:fill o:detectmouseclick="t"/>
+              <v:textbox style="mso-fit-shape-to-text:t" inset="0,15pt,0,0">
+                <w:txbxContent>
+                  <w:p>
+                    <w:pPr>
+                      <w:rPr>
+                        <w:rFonts w:ascii="Aptos" w:eastAsia="Aptos" w:hAnsi="Aptos" w:cs="Aptos"/>
+                        <w:noProof/>
+                        <w:color w:val="FF0000"/>
+                        <w:sz w:val="24"/>
+                        <w:szCs w:val="24"/>
+                      </w:rPr>
+                    </w:pPr>
+                    <w:r>
+                      <w:rPr>
+                        <w:rFonts w:ascii="Aptos" w:eastAsia="Aptos" w:hAnsi="Aptos" w:cs="Aptos"/>
+                        <w:noProof/>
+                        <w:color w:val="FF0000"/>
+                        <w:sz w:val="24"/>
+                        <w:szCs w:val="24"/>
+                      </w:rPr>
+                      <w:t>OFFICIAL</w:t>
+                    </w:r>
+                  </w:p>
+                </w:txbxContent>
+              </v:textbox>
+              <w10:wrap anchorx="page" anchory="page"/>
+            </v:shape>
+          </w:pict>
+        </mc:Fallback>
+      </mc:AlternateContent>
+    </w:r>
   </w:p>
 </w:hdr>
 </file>
@@ -4890,6 +5490,126 @@
     <w:pPr>
       <w:pStyle w:val="Header"/>
     </w:pPr>
+    <w:r>
+      <w:rPr>
+        <w:noProof/>
+        <w14:ligatures w14:val="standardContextual"/>
+      </w:rPr>
+      <mc:AlternateContent>
+        <mc:Choice Requires="wps">
+          <w:drawing>
+            <wp:anchor distT="0" distB="0" distL="0" distR="0" simplePos="0" relativeHeight="251658240" behindDoc="0" locked="0" layoutInCell="1" allowOverlap="1" wp14:anchorId="24A659E9" wp14:editId="71C7449F">
+              <wp:simplePos x="635" y="635"/>
+              <wp:positionH relativeFrom="page">
+                <wp:align>center</wp:align>
+              </wp:positionH>
+              <wp:positionV relativeFrom="page">
+                <wp:align>top</wp:align>
+              </wp:positionV>
+              <wp:extent cx="622300" cy="376555"/>
+              <wp:effectExtent l="0" t="0" r="6350" b="4445"/>
+              <wp:wrapNone/>
+              <wp:docPr id="803718848" name="Text Box 1" descr="OFFICIAL">
+                <a:extLst xmlns:a="http://schemas.openxmlformats.org/drawingml/2006/main">
+                  <a:ext uri="{5AE41FA2-C0FF-4470-9BD4-5FADCA87CBE2}">
+                    <aclsh:classification xmlns:aclsh="http://schemas.microsoft.com/office/drawing/2020/classificationShape" classificationOutcomeType="hdr"/>
+                  </a:ext>
+                </a:extLst>
+              </wp:docPr>
+              <wp:cNvGraphicFramePr/>
+              <a:graphic xmlns:a="http://schemas.openxmlformats.org/drawingml/2006/main">
+                <a:graphicData uri="http://schemas.microsoft.com/office/word/2010/wordprocessingShape">
+                  <wps:wsp>
+                    <wps:cNvSpPr txBox="1"/>
+                    <wps:spPr>
+                      <a:xfrm>
+                        <a:off x="0" y="0"/>
+                        <a:ext cx="622300" cy="376555"/>
+                      </a:xfrm>
+                      <a:prstGeom prst="rect">
+                        <a:avLst/>
+                      </a:prstGeom>
+                      <a:noFill/>
+                      <a:ln>
+                        <a:noFill/>
+                      </a:ln>
+                    </wps:spPr>
+                    <wps:txbx>
+                      <w:txbxContent>
+                        <w:p>
+                          <w:pPr>
+                            <w:rPr>
+                              <w:rFonts w:ascii="Aptos" w:eastAsia="Aptos" w:hAnsi="Aptos" w:cs="Aptos"/>
+                              <w:noProof/>
+                              <w:color w:val="FF0000"/>
+                              <w:sz w:val="24"/>
+                              <w:szCs w:val="24"/>
+                            </w:rPr>
+                          </w:pPr>
+                          <w:r>
+                            <w:rPr>
+                              <w:rFonts w:ascii="Aptos" w:eastAsia="Aptos" w:hAnsi="Aptos" w:cs="Aptos"/>
+                              <w:noProof/>
+                              <w:color w:val="FF0000"/>
+                              <w:sz w:val="24"/>
+                              <w:szCs w:val="24"/>
+                            </w:rPr>
+                            <w:t>OFFICIAL</w:t>
+                          </w:r>
+                        </w:p>
+                      </w:txbxContent>
+                    </wps:txbx>
+                    <wps:bodyPr rot="0" spcFirstLastPara="0" vertOverflow="overflow" horzOverflow="overflow" vert="horz" wrap="none" lIns="0" tIns="190500" rIns="0" bIns="0" numCol="1" spcCol="0" rtlCol="0" fromWordArt="0" anchor="t" anchorCtr="0" forceAA="0" compatLnSpc="1">
+                      <a:prstTxWarp prst="textNoShape">
+                        <a:avLst/>
+                      </a:prstTxWarp>
+                      <a:spAutoFit/>
+                    </wps:bodyPr>
+                  </wps:wsp>
+                </a:graphicData>
+              </a:graphic>
+            </wp:anchor>
+          </w:drawing>
+        </mc:Choice>
+        <mc:Fallback>
+          <w:pict>
+            <v:shapetype w14:anchorId="24A659E9" id="_x0000_t202" coordsize="21600,21600" o:spt="202" path="m,l,21600r21600,l21600,xe">
+              <v:stroke joinstyle="miter"/>
+              <v:path gradientshapeok="t" o:connecttype="rect"/>
+            </v:shapetype>
+            <v:shape id="Text Box 1" o:spid="_x0000_s1030" type="#_x0000_t202" alt="OFFICIAL" style="position:absolute;margin-left:0;margin-top:0;width:49pt;height:29.65pt;z-index:251658240;visibility:visible;mso-wrap-style:none;mso-wrap-distance-left:0;mso-wrap-distance-top:0;mso-wrap-distance-right:0;mso-wrap-distance-bottom:0;mso-position-horizontal:center;mso-position-horizontal-relative:page;mso-position-vertical:top;mso-position-vertical-relative:page;v-text-anchor:top" o:gfxdata="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" filled="f" stroked="f">
+              <v:fill o:detectmouseclick="t"/>
+              <v:textbox style="mso-fit-shape-to-text:t" inset="0,15pt,0,0">
+                <w:txbxContent>
+                  <w:p>
+                    <w:pPr>
+                      <w:rPr>
+                        <w:rFonts w:ascii="Aptos" w:eastAsia="Aptos" w:hAnsi="Aptos" w:cs="Aptos"/>
+                        <w:noProof/>
+                        <w:color w:val="FF0000"/>
+                        <w:sz w:val="24"/>
+                        <w:szCs w:val="24"/>
+                      </w:rPr>
+                    </w:pPr>
+                    <w:r>
+                      <w:rPr>
+                        <w:rFonts w:ascii="Aptos" w:eastAsia="Aptos" w:hAnsi="Aptos" w:cs="Aptos"/>
+                        <w:noProof/>
+                        <w:color w:val="FF0000"/>
+                        <w:sz w:val="24"/>
+                        <w:szCs w:val="24"/>
+                      </w:rPr>
+                      <w:t>OFFICIAL</w:t>
+                    </w:r>
+                  </w:p>
+                </w:txbxContent>
+              </v:textbox>
+              <w10:wrap anchorx="page" anchory="page"/>
+            </v:shape>
+          </w:pict>
+        </mc:Fallback>
+      </mc:AlternateContent>
+    </w:r>
   </w:p>
 </w:hdr>
 </file>

</xml_diff>